<commit_message>
fix(mobile): remove redundant TC 2.39 (Melihat detail Versi Aplikasi) and renumber Logout to 2.39
</commit_message>
<xml_diff>
--- a/SIT/SIT BTN SMART Mobile (Updated).docx
+++ b/SIT/SIT BTN SMART Mobile (Updated).docx
@@ -7118,134 +7118,8 @@
             <w:vAlign w:val="center"/>
           </w:tcPr>
           <w:p>
-            <w:pPr>
-              <w:pStyle w:val="TableParagraph"/>
-              <w:spacing w:before="134"/>
-              <w:ind w:left="176" w:right="168"/>
-              <w:jc w:val="center"/>
-            </w:pPr>
             <w:r>
               <w:t>2.30</w:t>
-            </w:r>
-          </w:p>
-        </w:tc>
-        <w:tc>
-          <w:tcPr>
-            <w:tcW w:w="2127" w:type="dxa"/>
-            <w:tcBorders>
-              <w:bottom w:val="single" w:sz="4" w:space="0" w:color="auto"/>
-            </w:tcBorders>
-            <w:vAlign w:val="center"/>
-          </w:tcPr>
-          <w:p>
-            <w:pPr>
-              <w:pStyle w:val="TableParagraph"/>
-              <w:jc w:val="center"/>
-            </w:pPr>
-            <w:r>
-              <w:t>Melihat detail Versi Aplikasi</w:t>
-            </w:r>
-          </w:p>
-        </w:tc>
-        <w:tc>
-          <w:tcPr>
-            <w:tcW w:w="2551" w:type="dxa"/>
-            <w:tcBorders>
-              <w:bottom w:val="single" w:sz="4" w:space="0" w:color="auto"/>
-            </w:tcBorders>
-            <w:vAlign w:val="center"/>
-          </w:tcPr>
-          <w:p>
-            <w:pPr>
-              <w:pStyle w:val="TableParagraph"/>
-              <w:jc w:val="center"/>
-              <w:rPr>
-                <w:w w:val="90"/>
-              </w:rPr>
-            </w:pPr>
-            <w:r>
-              <w:t>Klik menu Profile pada navigasi bawah - Lihat detail teks informasi Versi Aplikasi pada bagian Sistem</w:t>
-            </w:r>
-          </w:p>
-        </w:tc>
-        <w:tc>
-          <w:tcPr>
-            <w:tcW w:w="2833" w:type="dxa"/>
-            <w:vAlign w:val="center"/>
-          </w:tcPr>
-          <w:p>
-            <w:pPr>
-              <w:pStyle w:val="TableParagraph"/>
-              <w:jc w:val="center"/>
-            </w:pPr>
-            <w:r>
-              <w:t>Berhasil menampilkan informasi nomor/versi aplikasi yang digunakan saat ini secara jelas.</w:t>
-            </w:r>
-          </w:p>
-        </w:tc>
-        <w:tc>
-          <w:tcPr>
-            <w:tcW w:w="2833" w:type="dxa"/>
-            <w:vAlign w:val="center"/>
-          </w:tcPr>
-          <w:p>
-            <w:pPr>
-              <w:pStyle w:val="TableParagraph"/>
-              <w:jc w:val="center"/>
-            </w:pPr>
-            <w:r>
-              <w:t>Berhasil menampilkan informasi nomor/versi aplikasi yang digunakan saat ini secara jelas.</w:t>
-            </w:r>
-          </w:p>
-        </w:tc>
-        <w:tc>
-          <w:tcPr>
-            <w:tcW w:w="1277" w:type="dxa"/>
-            <w:vAlign w:val="center"/>
-          </w:tcPr>
-          <w:p>
-            <w:pPr>
-              <w:pStyle w:val="TableParagraph"/>
-              <w:jc w:val="center"/>
-            </w:pPr>
-            <w:r>
-              <w:t>P</w:t>
-            </w:r>
-          </w:p>
-        </w:tc>
-        <w:tc>
-          <w:tcPr>
-            <w:tcW w:w="1699" w:type="dxa"/>
-          </w:tcPr>
-          <w:p>
-            <w:pPr>
-              <w:pStyle w:val="TableParagraph"/>
-            </w:pPr>
-          </w:p>
-        </w:tc>
-      </w:tr>
-      <w:tr>
-        <w:trPr>
-          <w:trHeight w:val="537"/>
-        </w:trPr>
-        <w:tc>
-          <w:tcPr>
-            <w:tcW w:w="867" w:type="dxa"/>
-            <w:tcBorders>
-              <w:left w:val="single" w:sz="6" w:space="0" w:color="000000"/>
-              <w:bottom w:val="single" w:sz="4" w:space="0" w:color="auto"/>
-            </w:tcBorders>
-            <w:vAlign w:val="center"/>
-          </w:tcPr>
-          <w:p>
-            <w:pPr>
-              <w:pStyle w:val="TableParagraph"/>
-              <w:spacing w:before="134"/>
-              <w:ind w:left="176" w:right="168"/>
-              <w:jc w:val="center"/>
-            </w:pPr>
-            <w:r>
-              <w:t>2.31</w:t>
             </w:r>
           </w:p>
         </w:tc>

</xml_diff>

<commit_message>
feat(mobile): add 14 new test cases for Modul 15 Agenda - Pengingat (empty screenshots)
</commit_message>
<xml_diff>
--- a/SIT/SIT BTN SMART Mobile (Updated).docx
+++ b/SIT/SIT BTN SMART Mobile (Updated).docx
@@ -27823,12 +27823,6 @@
             <w:vAlign w:val="center"/>
           </w:tcPr>
           <w:p>
-            <w:pPr>
-              <w:pStyle w:val="TableParagraph"/>
-              <w:spacing w:before="134"/>
-              <w:ind w:left="176" w:right="168"/>
-              <w:jc w:val="center"/>
-            </w:pPr>
             <w:r>
               <w:t>9.1</w:t>
             </w:r>
@@ -27843,10 +27837,6 @@
             <w:vAlign w:val="center"/>
           </w:tcPr>
           <w:p>
-            <w:pPr>
-              <w:pStyle w:val="TableParagraph"/>
-              <w:jc w:val="center"/>
-            </w:pPr>
             <w:r>
               <w:t>Membuka halaman Pengingat</w:t>
             </w:r>
@@ -27861,45 +27851,30 @@
             <w:vAlign w:val="center"/>
           </w:tcPr>
           <w:p>
-            <w:pPr>
-              <w:pStyle w:val="TableParagraph"/>
-              <w:jc w:val="center"/>
-              <w:rPr>
-                <w:w w:val="90"/>
-              </w:rPr>
-            </w:pPr>
-            <w:r>
-              <w:t>Buka menu Lainnya - Klik menu Pengingat</w:t>
-            </w:r>
-          </w:p>
-        </w:tc>
-        <w:tc>
-          <w:tcPr>
-            <w:tcW w:w="2833" w:type="dxa"/>
-            <w:vAlign w:val="center"/>
-          </w:tcPr>
-          <w:p>
-            <w:pPr>
-              <w:pStyle w:val="TableParagraph"/>
-              <w:jc w:val="center"/>
-            </w:pPr>
-            <w:r>
-              <w:t>Berhasil menampilkan halaman Pengingat.</w:t>
-            </w:r>
-          </w:p>
-        </w:tc>
-        <w:tc>
-          <w:tcPr>
-            <w:tcW w:w="2833" w:type="dxa"/>
-            <w:vAlign w:val="center"/>
-          </w:tcPr>
-          <w:p>
-            <w:pPr>
-              <w:pStyle w:val="TableParagraph"/>
-              <w:jc w:val="center"/>
-            </w:pPr>
-            <w:r>
-              <w:t>Berhasil menampilkan halaman Pengingat.</w:t>
+            <w:r>
+              <w:t>Buka menu Lainnya pada Aksi Cepat di Beranda - Klik menu Pengingat pada kelompok Agenda</w:t>
+            </w:r>
+          </w:p>
+        </w:tc>
+        <w:tc>
+          <w:tcPr>
+            <w:tcW w:w="2833" w:type="dxa"/>
+            <w:vAlign w:val="center"/>
+          </w:tcPr>
+          <w:p>
+            <w:r>
+              <w:t>Berhasil menampilkan halaman Pengingat beserta daftar tugas pada tab default (Task).</w:t>
+            </w:r>
+          </w:p>
+        </w:tc>
+        <w:tc>
+          <w:tcPr>
+            <w:tcW w:w="2833" w:type="dxa"/>
+            <w:vAlign w:val="center"/>
+          </w:tcPr>
+          <w:p>
+            <w:r>
+              <w:t>Berhasil menampilkan halaman Pengingat beserta daftar tugas pada tab default (Task).</w:t>
             </w:r>
           </w:p>
         </w:tc>
@@ -27909,10 +27884,6 @@
             <w:vAlign w:val="center"/>
           </w:tcPr>
           <w:p>
-            <w:pPr>
-              <w:pStyle w:val="TableParagraph"/>
-              <w:jc w:val="center"/>
-            </w:pPr>
             <w:r>
               <w:t>P</w:t>
             </w:r>
@@ -27923,9 +27894,7 @@
             <w:tcW w:w="1699" w:type="dxa"/>
           </w:tcPr>
           <w:p>
-            <w:pPr>
-              <w:pStyle w:val="TableParagraph"/>
-            </w:pPr>
+            <w:r/>
           </w:p>
         </w:tc>
       </w:tr>
@@ -27943,12 +27912,6 @@
             <w:vAlign w:val="center"/>
           </w:tcPr>
           <w:p>
-            <w:pPr>
-              <w:pStyle w:val="TableParagraph"/>
-              <w:spacing w:before="134"/>
-              <w:ind w:left="176" w:right="168"/>
-              <w:jc w:val="center"/>
-            </w:pPr>
             <w:r>
               <w:t>9.2</w:t>
             </w:r>
@@ -27963,12 +27926,8 @@
             <w:vAlign w:val="center"/>
           </w:tcPr>
           <w:p>
-            <w:pPr>
-              <w:pStyle w:val="TableParagraph"/>
-              <w:jc w:val="center"/>
-            </w:pPr>
-            <w:r>
-              <w:t>Melihat daftar pengingat pada tab Aktif</w:t>
+            <w:r>
+              <w:t>Melihat daftar agenda pada tab Acara</w:t>
             </w:r>
           </w:p>
         </w:tc>
@@ -27981,45 +27940,30 @@
             <w:vAlign w:val="center"/>
           </w:tcPr>
           <w:p>
-            <w:pPr>
-              <w:pStyle w:val="TableParagraph"/>
-              <w:jc w:val="center"/>
-              <w:rPr>
-                <w:w w:val="90"/>
-              </w:rPr>
-            </w:pPr>
-            <w:r>
-              <w:t>Klik tab Aktif</w:t>
-            </w:r>
-          </w:p>
-        </w:tc>
-        <w:tc>
-          <w:tcPr>
-            <w:tcW w:w="2833" w:type="dxa"/>
-            <w:vAlign w:val="center"/>
-          </w:tcPr>
-          <w:p>
-            <w:pPr>
-              <w:pStyle w:val="TableParagraph"/>
-              <w:jc w:val="center"/>
-            </w:pPr>
-            <w:r>
-              <w:t>Berhasil menampilkan daftar pengingat yang sedang aktif.</w:t>
-            </w:r>
-          </w:p>
-        </w:tc>
-        <w:tc>
-          <w:tcPr>
-            <w:tcW w:w="2833" w:type="dxa"/>
-            <w:vAlign w:val="center"/>
-          </w:tcPr>
-          <w:p>
-            <w:pPr>
-              <w:pStyle w:val="TableParagraph"/>
-              <w:jc w:val="center"/>
-            </w:pPr>
-            <w:r>
-              <w:t>Berhasil menampilkan daftar pengingat yang sedang aktif.</w:t>
+            <w:r>
+              <w:t>Pada halaman Pengingat, klik tab Acara</w:t>
+            </w:r>
+          </w:p>
+        </w:tc>
+        <w:tc>
+          <w:tcPr>
+            <w:tcW w:w="2833" w:type="dxa"/>
+            <w:vAlign w:val="center"/>
+          </w:tcPr>
+          <w:p>
+            <w:r>
+              <w:t>Berhasil menampilkan daftar acara yang terdaftar pada tab Acara.</w:t>
+            </w:r>
+          </w:p>
+        </w:tc>
+        <w:tc>
+          <w:tcPr>
+            <w:tcW w:w="2833" w:type="dxa"/>
+            <w:vAlign w:val="center"/>
+          </w:tcPr>
+          <w:p>
+            <w:r>
+              <w:t>Berhasil menampilkan daftar acara yang terdaftar pada tab Acara.</w:t>
             </w:r>
           </w:p>
         </w:tc>
@@ -28029,10 +27973,6 @@
             <w:vAlign w:val="center"/>
           </w:tcPr>
           <w:p>
-            <w:pPr>
-              <w:pStyle w:val="TableParagraph"/>
-              <w:jc w:val="center"/>
-            </w:pPr>
             <w:r>
               <w:t>P</w:t>
             </w:r>
@@ -28043,9 +27983,7 @@
             <w:tcW w:w="1699" w:type="dxa"/>
           </w:tcPr>
           <w:p>
-            <w:pPr>
-              <w:pStyle w:val="TableParagraph"/>
-            </w:pPr>
+            <w:r/>
           </w:p>
         </w:tc>
       </w:tr>
@@ -28063,12 +28001,6 @@
             <w:vAlign w:val="center"/>
           </w:tcPr>
           <w:p>
-            <w:pPr>
-              <w:pStyle w:val="TableParagraph"/>
-              <w:spacing w:before="134"/>
-              <w:ind w:left="176" w:right="168"/>
-              <w:jc w:val="center"/>
-            </w:pPr>
             <w:r>
               <w:t>9.3</w:t>
             </w:r>
@@ -28083,12 +28015,8 @@
             <w:vAlign w:val="center"/>
           </w:tcPr>
           <w:p>
-            <w:pPr>
-              <w:pStyle w:val="TableParagraph"/>
-              <w:jc w:val="center"/>
-            </w:pPr>
-            <w:r>
-              <w:t>Melihat daftar pengingat pada tab Selesai</w:t>
+            <w:r>
+              <w:t>Melihat detail task</w:t>
             </w:r>
           </w:p>
         </w:tc>
@@ -28101,45 +28029,30 @@
             <w:vAlign w:val="center"/>
           </w:tcPr>
           <w:p>
-            <w:pPr>
-              <w:pStyle w:val="TableParagraph"/>
-              <w:jc w:val="center"/>
-              <w:rPr>
-                <w:w w:val="90"/>
-              </w:rPr>
-            </w:pPr>
-            <w:r>
-              <w:t>Klik tab Selesai</w:t>
-            </w:r>
-          </w:p>
-        </w:tc>
-        <w:tc>
-          <w:tcPr>
-            <w:tcW w:w="2833" w:type="dxa"/>
-            <w:vAlign w:val="center"/>
-          </w:tcPr>
-          <w:p>
-            <w:pPr>
-              <w:pStyle w:val="TableParagraph"/>
-              <w:jc w:val="center"/>
-            </w:pPr>
-            <w:r>
-              <w:t>Berhasil menampilkan daftar pengingat yang sudah selesai.</w:t>
-            </w:r>
-          </w:p>
-        </w:tc>
-        <w:tc>
-          <w:tcPr>
-            <w:tcW w:w="2833" w:type="dxa"/>
-            <w:vAlign w:val="center"/>
-          </w:tcPr>
-          <w:p>
-            <w:pPr>
-              <w:pStyle w:val="TableParagraph"/>
-              <w:jc w:val="center"/>
-            </w:pPr>
-            <w:r>
-              <w:t>Berhasil menampilkan daftar pengingat yang sudah selesai.</w:t>
+            <w:r>
+              <w:t>Pada tab Task, klik salah satu card task yang terdaftar</w:t>
+            </w:r>
+          </w:p>
+        </w:tc>
+        <w:tc>
+          <w:tcPr>
+            <w:tcW w:w="2833" w:type="dxa"/>
+            <w:vAlign w:val="center"/>
+          </w:tcPr>
+          <w:p>
+            <w:r>
+              <w:t>Berhasil menampilkan halaman Detail Task yang memuat seluruh informasi task.</w:t>
+            </w:r>
+          </w:p>
+        </w:tc>
+        <w:tc>
+          <w:tcPr>
+            <w:tcW w:w="2833" w:type="dxa"/>
+            <w:vAlign w:val="center"/>
+          </w:tcPr>
+          <w:p>
+            <w:r>
+              <w:t>Berhasil menampilkan halaman Detail Task yang memuat seluruh informasi task.</w:t>
             </w:r>
           </w:p>
         </w:tc>
@@ -28149,10 +28062,6 @@
             <w:vAlign w:val="center"/>
           </w:tcPr>
           <w:p>
-            <w:pPr>
-              <w:pStyle w:val="TableParagraph"/>
-              <w:jc w:val="center"/>
-            </w:pPr>
             <w:r>
               <w:t>P</w:t>
             </w:r>
@@ -28163,9 +28072,7 @@
             <w:tcW w:w="1699" w:type="dxa"/>
           </w:tcPr>
           <w:p>
-            <w:pPr>
-              <w:pStyle w:val="TableParagraph"/>
-            </w:pPr>
+            <w:r/>
           </w:p>
         </w:tc>
       </w:tr>
@@ -28183,12 +28090,6 @@
             <w:vAlign w:val="center"/>
           </w:tcPr>
           <w:p>
-            <w:pPr>
-              <w:pStyle w:val="TableParagraph"/>
-              <w:spacing w:before="134"/>
-              <w:ind w:left="176" w:right="168"/>
-              <w:jc w:val="center"/>
-            </w:pPr>
             <w:r>
               <w:t>9.4</w:t>
             </w:r>
@@ -28203,12 +28104,8 @@
             <w:vAlign w:val="center"/>
           </w:tcPr>
           <w:p>
-            <w:pPr>
-              <w:pStyle w:val="TableParagraph"/>
-              <w:jc w:val="center"/>
-            </w:pPr>
-            <w:r>
-              <w:t>Menambahkan pengingat baru dengan data valid</w:t>
+            <w:r>
+              <w:t>Mengubah data task dengan data valid</w:t>
             </w:r>
           </w:p>
         </w:tc>
@@ -28221,45 +28118,30 @@
             <w:vAlign w:val="center"/>
           </w:tcPr>
           <w:p>
-            <w:pPr>
-              <w:pStyle w:val="TableParagraph"/>
-              <w:jc w:val="center"/>
-              <w:rPr>
-                <w:w w:val="90"/>
-              </w:rPr>
-            </w:pPr>
-            <w:r>
-              <w:t>Klik button + Baru - Mengisi seluruh field mandatory pada form Tambah Pengingat dengan data valid - Klik button Simpan</w:t>
-            </w:r>
-          </w:p>
-        </w:tc>
-        <w:tc>
-          <w:tcPr>
-            <w:tcW w:w="2833" w:type="dxa"/>
-            <w:vAlign w:val="center"/>
-          </w:tcPr>
-          <w:p>
-            <w:pPr>
-              <w:pStyle w:val="TableParagraph"/>
-              <w:jc w:val="center"/>
-            </w:pPr>
-            <w:r>
-              <w:t>Berhasil menyimpan pengingat dan menampilkan pengingat baru pada daftar.</w:t>
-            </w:r>
-          </w:p>
-        </w:tc>
-        <w:tc>
-          <w:tcPr>
-            <w:tcW w:w="2833" w:type="dxa"/>
-            <w:vAlign w:val="center"/>
-          </w:tcPr>
-          <w:p>
-            <w:pPr>
-              <w:pStyle w:val="TableParagraph"/>
-              <w:jc w:val="center"/>
-            </w:pPr>
-            <w:r>
-              <w:t>Berhasil menyimpan pengingat dan menampilkan pengingat baru pada daftar.</w:t>
+            <w:r>
+              <w:t>Pada halaman Detail Task, klik icon Edit (pensil) - Ubah data task pada form Edit Task - Klik button Simpan</w:t>
+            </w:r>
+          </w:p>
+        </w:tc>
+        <w:tc>
+          <w:tcPr>
+            <w:tcW w:w="2833" w:type="dxa"/>
+            <w:vAlign w:val="center"/>
+          </w:tcPr>
+          <w:p>
+            <w:r>
+              <w:t>Berhasil menyimpan perubahan data task dengan data yang valid.</w:t>
+            </w:r>
+          </w:p>
+        </w:tc>
+        <w:tc>
+          <w:tcPr>
+            <w:tcW w:w="2833" w:type="dxa"/>
+            <w:vAlign w:val="center"/>
+          </w:tcPr>
+          <w:p>
+            <w:r>
+              <w:t>Berhasil menyimpan perubahan data task dengan data yang valid.</w:t>
             </w:r>
           </w:p>
         </w:tc>
@@ -28269,10 +28151,6 @@
             <w:vAlign w:val="center"/>
           </w:tcPr>
           <w:p>
-            <w:pPr>
-              <w:pStyle w:val="TableParagraph"/>
-              <w:jc w:val="center"/>
-            </w:pPr>
             <w:r>
               <w:t>P</w:t>
             </w:r>
@@ -28283,9 +28161,7 @@
             <w:tcW w:w="1699" w:type="dxa"/>
           </w:tcPr>
           <w:p>
-            <w:pPr>
-              <w:pStyle w:val="TableParagraph"/>
-            </w:pPr>
+            <w:r/>
           </w:p>
         </w:tc>
       </w:tr>
@@ -28303,12 +28179,6 @@
             <w:vAlign w:val="center"/>
           </w:tcPr>
           <w:p>
-            <w:pPr>
-              <w:pStyle w:val="TableParagraph"/>
-              <w:spacing w:before="134"/>
-              <w:ind w:left="176" w:right="168"/>
-              <w:jc w:val="center"/>
-            </w:pPr>
             <w:r>
               <w:t>9.5</w:t>
             </w:r>
@@ -28323,12 +28193,8 @@
             <w:vAlign w:val="center"/>
           </w:tcPr>
           <w:p>
-            <w:pPr>
-              <w:pStyle w:val="TableParagraph"/>
-              <w:jc w:val="center"/>
-            </w:pPr>
-            <w:r>
-              <w:t>Menambahkan pengingat baru tanpa mengisi field mandatory</w:t>
+            <w:r>
+              <w:t>Membagikan task kepada user</w:t>
             </w:r>
           </w:p>
         </w:tc>
@@ -28341,45 +28207,30 @@
             <w:vAlign w:val="center"/>
           </w:tcPr>
           <w:p>
-            <w:pPr>
-              <w:pStyle w:val="TableParagraph"/>
-              <w:jc w:val="center"/>
-              <w:rPr>
-                <w:w w:val="90"/>
-              </w:rPr>
-            </w:pPr>
-            <w:r>
-              <w:t>Klik button + Baru - Mengosongkan seluruh field mandatory pada form Tambah Pengingat - Klik button Simpan</w:t>
-            </w:r>
-          </w:p>
-        </w:tc>
-        <w:tc>
-          <w:tcPr>
-            <w:tcW w:w="2833" w:type="dxa"/>
-            <w:vAlign w:val="center"/>
-          </w:tcPr>
-          <w:p>
-            <w:pPr>
-              <w:pStyle w:val="TableParagraph"/>
-              <w:jc w:val="center"/>
-            </w:pPr>
-            <w:r>
-              <w:t>Berhasil menampilkan pesan validasi bahwa field mandatory harus diisi.</w:t>
-            </w:r>
-          </w:p>
-        </w:tc>
-        <w:tc>
-          <w:tcPr>
-            <w:tcW w:w="2833" w:type="dxa"/>
-            <w:vAlign w:val="center"/>
-          </w:tcPr>
-          <w:p>
-            <w:pPr>
-              <w:pStyle w:val="TableParagraph"/>
-              <w:jc w:val="center"/>
-            </w:pPr>
-            <w:r>
-              <w:t>Berhasil menampilkan pesan validasi bahwa field mandatory harus diisi.</w:t>
+            <w:r>
+              <w:t>Pada halaman Detail Task, klik icon Bagikan (share) - Pilih role atau user yang ditugaskan - Klik button Bagikan</w:t>
+            </w:r>
+          </w:p>
+        </w:tc>
+        <w:tc>
+          <w:tcPr>
+            <w:tcW w:w="2833" w:type="dxa"/>
+            <w:vAlign w:val="center"/>
+          </w:tcPr>
+          <w:p>
+            <w:r>
+              <w:t>Berhasil membagikan task kepada user dan menampilkan pesan konfirmasi Task berhasil dibagikan.</w:t>
+            </w:r>
+          </w:p>
+        </w:tc>
+        <w:tc>
+          <w:tcPr>
+            <w:tcW w:w="2833" w:type="dxa"/>
+            <w:vAlign w:val="center"/>
+          </w:tcPr>
+          <w:p>
+            <w:r>
+              <w:t>Berhasil membagikan task kepada user dan menampilkan pesan konfirmasi Task berhasil dibagikan.</w:t>
             </w:r>
           </w:p>
         </w:tc>
@@ -28389,10 +28240,6 @@
             <w:vAlign w:val="center"/>
           </w:tcPr>
           <w:p>
-            <w:pPr>
-              <w:pStyle w:val="TableParagraph"/>
-              <w:jc w:val="center"/>
-            </w:pPr>
             <w:r>
               <w:t>P</w:t>
             </w:r>
@@ -28403,9 +28250,7 @@
             <w:tcW w:w="1699" w:type="dxa"/>
           </w:tcPr>
           <w:p>
-            <w:pPr>
-              <w:pStyle w:val="TableParagraph"/>
-            </w:pPr>
+            <w:r/>
           </w:p>
         </w:tc>
       </w:tr>
@@ -28423,12 +28268,6 @@
             <w:vAlign w:val="center"/>
           </w:tcPr>
           <w:p>
-            <w:pPr>
-              <w:pStyle w:val="TableParagraph"/>
-              <w:spacing w:before="134"/>
-              <w:ind w:left="176" w:right="168"/>
-              <w:jc w:val="center"/>
-            </w:pPr>
             <w:r>
               <w:t>9.6</w:t>
             </w:r>
@@ -28443,12 +28282,8 @@
             <w:vAlign w:val="center"/>
           </w:tcPr>
           <w:p>
-            <w:pPr>
-              <w:pStyle w:val="TableParagraph"/>
-              <w:jc w:val="center"/>
-            </w:pPr>
-            <w:r>
-              <w:t>Menandai pengingat sebagai selesai</w:t>
+            <w:r>
+              <w:t>Menghapus penugasan task kepada user</w:t>
             </w:r>
           </w:p>
         </w:tc>
@@ -28461,45 +28296,30 @@
             <w:vAlign w:val="center"/>
           </w:tcPr>
           <w:p>
-            <w:pPr>
-              <w:pStyle w:val="TableParagraph"/>
-              <w:jc w:val="center"/>
-              <w:rPr>
-                <w:w w:val="90"/>
-              </w:rPr>
-            </w:pPr>
-            <w:r>
-              <w:t>Centang checkbox pada salah satu card pengingat aktif - Klik button Ya pada pop-up konfirmasi</w:t>
-            </w:r>
-          </w:p>
-        </w:tc>
-        <w:tc>
-          <w:tcPr>
-            <w:tcW w:w="2833" w:type="dxa"/>
-            <w:vAlign w:val="center"/>
-          </w:tcPr>
-          <w:p>
-            <w:pPr>
-              <w:pStyle w:val="TableParagraph"/>
-              <w:jc w:val="center"/>
-            </w:pPr>
-            <w:r>
-              <w:t>Berhasil menandai pengingat sebagai selesai dan memindahkan pengingat ke tab Selesai.</w:t>
-            </w:r>
-          </w:p>
-        </w:tc>
-        <w:tc>
-          <w:tcPr>
-            <w:tcW w:w="2833" w:type="dxa"/>
-            <w:vAlign w:val="center"/>
-          </w:tcPr>
-          <w:p>
-            <w:pPr>
-              <w:pStyle w:val="TableParagraph"/>
-              <w:jc w:val="center"/>
-            </w:pPr>
-            <w:r>
-              <w:t>Berhasil menandai pengingat sebagai selesai dan memindahkan pengingat ke tab Selesai.</w:t>
+            <w:r>
+              <w:t>Pada form Bagikan Task, periksa daftar Ditugaskan ke (User) - Klik icon hapus (tempat sampah) pada user yang ditugaskan - Konfirmasi penghapusan penugasan task</w:t>
+            </w:r>
+          </w:p>
+        </w:tc>
+        <w:tc>
+          <w:tcPr>
+            <w:tcW w:w="2833" w:type="dxa"/>
+            <w:vAlign w:val="center"/>
+          </w:tcPr>
+          <w:p>
+            <w:r>
+              <w:t>Berhasil menghapus penugasan task kepada user dari daftar pembagian task.</w:t>
+            </w:r>
+          </w:p>
+        </w:tc>
+        <w:tc>
+          <w:tcPr>
+            <w:tcW w:w="2833" w:type="dxa"/>
+            <w:vAlign w:val="center"/>
+          </w:tcPr>
+          <w:p>
+            <w:r>
+              <w:t>Berhasil menghapus penugasan task kepada user dari daftar pembagian task.</w:t>
             </w:r>
           </w:p>
         </w:tc>
@@ -28509,10 +28329,6 @@
             <w:vAlign w:val="center"/>
           </w:tcPr>
           <w:p>
-            <w:pPr>
-              <w:pStyle w:val="TableParagraph"/>
-              <w:jc w:val="center"/>
-            </w:pPr>
             <w:r>
               <w:t>P</w:t>
             </w:r>
@@ -28523,9 +28339,7 @@
             <w:tcW w:w="1699" w:type="dxa"/>
           </w:tcPr>
           <w:p>
-            <w:pPr>
-              <w:pStyle w:val="TableParagraph"/>
-            </w:pPr>
+            <w:r/>
           </w:p>
         </w:tc>
       </w:tr>
@@ -28543,12 +28357,6 @@
             <w:vAlign w:val="center"/>
           </w:tcPr>
           <w:p>
-            <w:pPr>
-              <w:pStyle w:val="TableParagraph"/>
-              <w:spacing w:before="134"/>
-              <w:ind w:left="176" w:right="168"/>
-              <w:jc w:val="center"/>
-            </w:pPr>
             <w:r>
               <w:t>9.7</w:t>
             </w:r>
@@ -28563,12 +28371,8 @@
             <w:vAlign w:val="center"/>
           </w:tcPr>
           <w:p>
-            <w:pPr>
-              <w:pStyle w:val="TableParagraph"/>
-              <w:jc w:val="center"/>
-            </w:pPr>
-            <w:r>
-              <w:t>Membuka halaman Daily Sales Agenda</w:t>
+            <w:r>
+              <w:t>Menambahkan komentar pada task</w:t>
             </w:r>
           </w:p>
         </w:tc>
@@ -28581,45 +28385,30 @@
             <w:vAlign w:val="center"/>
           </w:tcPr>
           <w:p>
-            <w:pPr>
-              <w:pStyle w:val="TableParagraph"/>
-              <w:jc w:val="center"/>
-              <w:rPr>
-                <w:w w:val="90"/>
-              </w:rPr>
-            </w:pPr>
-            <w:r>
-              <w:t>Buka menu Lainnya - Klik menu Daily Sales Agenda</w:t>
-            </w:r>
-          </w:p>
-        </w:tc>
-        <w:tc>
-          <w:tcPr>
-            <w:tcW w:w="2833" w:type="dxa"/>
-            <w:vAlign w:val="center"/>
-          </w:tcPr>
-          <w:p>
-            <w:pPr>
-              <w:pStyle w:val="TableParagraph"/>
-              <w:jc w:val="center"/>
-            </w:pPr>
-            <w:r>
-              <w:t>Berhasil menampilkan halaman Daily Sales Agenda.</w:t>
-            </w:r>
-          </w:p>
-        </w:tc>
-        <w:tc>
-          <w:tcPr>
-            <w:tcW w:w="2833" w:type="dxa"/>
-            <w:vAlign w:val="center"/>
-          </w:tcPr>
-          <w:p>
-            <w:pPr>
-              <w:pStyle w:val="TableParagraph"/>
-              <w:jc w:val="center"/>
-            </w:pPr>
-            <w:r>
-              <w:t>Berhasil menampilkan halaman Daily Sales Agenda.</w:t>
+            <w:r>
+              <w:t>Pada halaman Detail Task, klik tab Aktivitas &amp; Percakapan - Tulis komentar pada kolom Tulis komentar - Klik button Kirim</w:t>
+            </w:r>
+          </w:p>
+        </w:tc>
+        <w:tc>
+          <w:tcPr>
+            <w:tcW w:w="2833" w:type="dxa"/>
+            <w:vAlign w:val="center"/>
+          </w:tcPr>
+          <w:p>
+            <w:r>
+              <w:t>Berhasil mengirimkan komentar dan menampilkan komentar baru pada daftar riwayat aktivitas task.</w:t>
+            </w:r>
+          </w:p>
+        </w:tc>
+        <w:tc>
+          <w:tcPr>
+            <w:tcW w:w="2833" w:type="dxa"/>
+            <w:vAlign w:val="center"/>
+          </w:tcPr>
+          <w:p>
+            <w:r>
+              <w:t>Berhasil mengirimkan komentar dan menampilkan komentar baru pada daftar riwayat aktivitas task.</w:t>
             </w:r>
           </w:p>
         </w:tc>
@@ -28629,10 +28418,6 @@
             <w:vAlign w:val="center"/>
           </w:tcPr>
           <w:p>
-            <w:pPr>
-              <w:pStyle w:val="TableParagraph"/>
-              <w:jc w:val="center"/>
-            </w:pPr>
             <w:r>
               <w:t>P</w:t>
             </w:r>
@@ -28643,9 +28428,7 @@
             <w:tcW w:w="1699" w:type="dxa"/>
           </w:tcPr>
           <w:p>
-            <w:pPr>
-              <w:pStyle w:val="TableParagraph"/>
-            </w:pPr>
+            <w:r/>
           </w:p>
         </w:tc>
       </w:tr>
@@ -28663,12 +28446,6 @@
             <w:vAlign w:val="center"/>
           </w:tcPr>
           <w:p>
-            <w:pPr>
-              <w:pStyle w:val="TableParagraph"/>
-              <w:spacing w:before="134"/>
-              <w:ind w:left="176" w:right="168"/>
-              <w:jc w:val="center"/>
-            </w:pPr>
             <w:r>
               <w:t>9.8</w:t>
             </w:r>
@@ -28683,16 +28460,8 @@
             <w:vAlign w:val="center"/>
           </w:tcPr>
           <w:p>
-            <w:pPr>
-              <w:pStyle w:val="TableParagraph"/>
-              <w:jc w:val="center"/>
-            </w:pPr>
-            <w:r>
-              <w:t xml:space="preserve">Melihat daftar agenda pada tab </w:t>
-            </w:r>
-            <w:r>
-              <w:lastRenderedPageBreak/>
-              <w:t>Masuk</w:t>
+            <w:r>
+              <w:t>Menghapus komentar pada task</w:t>
             </w:r>
           </w:p>
         </w:tc>
@@ -28705,55 +28474,30 @@
             <w:vAlign w:val="center"/>
           </w:tcPr>
           <w:p>
-            <w:pPr>
-              <w:pStyle w:val="TableParagraph"/>
-              <w:jc w:val="center"/>
-              <w:rPr>
-                <w:w w:val="90"/>
-              </w:rPr>
-            </w:pPr>
-            <w:r>
-              <w:lastRenderedPageBreak/>
-              <w:t>Klik tab Masuk</w:t>
-            </w:r>
-          </w:p>
-        </w:tc>
-        <w:tc>
-          <w:tcPr>
-            <w:tcW w:w="2833" w:type="dxa"/>
-            <w:vAlign w:val="center"/>
-          </w:tcPr>
-          <w:p>
-            <w:pPr>
-              <w:pStyle w:val="TableParagraph"/>
-              <w:jc w:val="center"/>
-            </w:pPr>
-            <w:r>
-              <w:t xml:space="preserve">Berhasil menampilkan daftar nasabah yang masuk </w:t>
-            </w:r>
-            <w:r>
-              <w:lastRenderedPageBreak/>
-              <w:t>pada Daily Sales Agenda.</w:t>
-            </w:r>
-          </w:p>
-        </w:tc>
-        <w:tc>
-          <w:tcPr>
-            <w:tcW w:w="2833" w:type="dxa"/>
-            <w:vAlign w:val="center"/>
-          </w:tcPr>
-          <w:p>
-            <w:pPr>
-              <w:pStyle w:val="TableParagraph"/>
-              <w:jc w:val="center"/>
-            </w:pPr>
-            <w:r>
-              <w:lastRenderedPageBreak/>
-              <w:t xml:space="preserve">Berhasil menampilkan daftar nasabah yang masuk </w:t>
-            </w:r>
-            <w:r>
-              <w:lastRenderedPageBreak/>
-              <w:t>pada Daily Sales Agenda.</w:t>
+            <w:r>
+              <w:t>Pada halaman Detail Task, klik tab Aktivitas &amp; Percakapan - Klik icon hapus (tempat sampah) pada komentar yang ingin dihapus - Konfirmasi penghapusan komentar</w:t>
+            </w:r>
+          </w:p>
+        </w:tc>
+        <w:tc>
+          <w:tcPr>
+            <w:tcW w:w="2833" w:type="dxa"/>
+            <w:vAlign w:val="center"/>
+          </w:tcPr>
+          <w:p>
+            <w:r>
+              <w:t>Berhasil menghapus komentar dari daftar aktivitas dan percakapan task.</w:t>
+            </w:r>
+          </w:p>
+        </w:tc>
+        <w:tc>
+          <w:tcPr>
+            <w:tcW w:w="2833" w:type="dxa"/>
+            <w:vAlign w:val="center"/>
+          </w:tcPr>
+          <w:p>
+            <w:r>
+              <w:t>Berhasil menghapus komentar dari daftar aktivitas dan percakapan task.</w:t>
             </w:r>
           </w:p>
         </w:tc>
@@ -28763,12 +28507,7 @@
             <w:vAlign w:val="center"/>
           </w:tcPr>
           <w:p>
-            <w:pPr>
-              <w:pStyle w:val="TableParagraph"/>
-              <w:jc w:val="center"/>
-            </w:pPr>
-            <w:r>
-              <w:lastRenderedPageBreak/>
+            <w:r>
               <w:t>P</w:t>
             </w:r>
           </w:p>
@@ -28778,9 +28517,7 @@
             <w:tcW w:w="1699" w:type="dxa"/>
           </w:tcPr>
           <w:p>
-            <w:pPr>
-              <w:pStyle w:val="TableParagraph"/>
-            </w:pPr>
+            <w:r/>
           </w:p>
         </w:tc>
       </w:tr>
@@ -28798,12 +28535,6 @@
             <w:vAlign w:val="center"/>
           </w:tcPr>
           <w:p>
-            <w:pPr>
-              <w:pStyle w:val="TableParagraph"/>
-              <w:spacing w:before="134"/>
-              <w:ind w:left="176" w:right="168"/>
-              <w:jc w:val="center"/>
-            </w:pPr>
             <w:r>
               <w:t>9.9</w:t>
             </w:r>
@@ -28818,12 +28549,8 @@
             <w:vAlign w:val="center"/>
           </w:tcPr>
           <w:p>
-            <w:pPr>
-              <w:pStyle w:val="TableParagraph"/>
-              <w:jc w:val="center"/>
-            </w:pPr>
-            <w:r>
-              <w:t>Melihat daftar agenda pada tab Closing</w:t>
+            <w:r>
+              <w:t>Melihat detail acara</w:t>
             </w:r>
           </w:p>
         </w:tc>
@@ -28836,45 +28563,30 @@
             <w:vAlign w:val="center"/>
           </w:tcPr>
           <w:p>
-            <w:pPr>
-              <w:pStyle w:val="TableParagraph"/>
-              <w:jc w:val="center"/>
-              <w:rPr>
-                <w:w w:val="90"/>
-              </w:rPr>
-            </w:pPr>
-            <w:r>
-              <w:t>Klik tab Closing</w:t>
-            </w:r>
-          </w:p>
-        </w:tc>
-        <w:tc>
-          <w:tcPr>
-            <w:tcW w:w="2833" w:type="dxa"/>
-            <w:vAlign w:val="center"/>
-          </w:tcPr>
-          <w:p>
-            <w:pPr>
-              <w:pStyle w:val="TableParagraph"/>
-              <w:jc w:val="center"/>
-            </w:pPr>
-            <w:r>
-              <w:t>Berhasil menampilkan daftar nasabah yang closing pada Daily Sales Agenda.</w:t>
-            </w:r>
-          </w:p>
-        </w:tc>
-        <w:tc>
-          <w:tcPr>
-            <w:tcW w:w="2833" w:type="dxa"/>
-            <w:vAlign w:val="center"/>
-          </w:tcPr>
-          <w:p>
-            <w:pPr>
-              <w:pStyle w:val="TableParagraph"/>
-              <w:jc w:val="center"/>
-            </w:pPr>
-            <w:r>
-              <w:t>Berhasil menampilkan daftar nasabah yang closing pada Daily Sales Agenda.</w:t>
+            <w:r>
+              <w:t>Pada tab Acara, klik salah satu card acara yang terdaftar</w:t>
+            </w:r>
+          </w:p>
+        </w:tc>
+        <w:tc>
+          <w:tcPr>
+            <w:tcW w:w="2833" w:type="dxa"/>
+            <w:vAlign w:val="center"/>
+          </w:tcPr>
+          <w:p>
+            <w:r>
+              <w:t>Berhasil menampilkan halaman Detail Acara yang memuat seluruh informasi acara.</w:t>
+            </w:r>
+          </w:p>
+        </w:tc>
+        <w:tc>
+          <w:tcPr>
+            <w:tcW w:w="2833" w:type="dxa"/>
+            <w:vAlign w:val="center"/>
+          </w:tcPr>
+          <w:p>
+            <w:r>
+              <w:t>Berhasil menampilkan halaman Detail Acara yang memuat seluruh informasi acara.</w:t>
             </w:r>
           </w:p>
         </w:tc>
@@ -28884,10 +28596,6 @@
             <w:vAlign w:val="center"/>
           </w:tcPr>
           <w:p>
-            <w:pPr>
-              <w:pStyle w:val="TableParagraph"/>
-              <w:jc w:val="center"/>
-            </w:pPr>
             <w:r>
               <w:t>P</w:t>
             </w:r>
@@ -28898,9 +28606,7 @@
             <w:tcW w:w="1699" w:type="dxa"/>
           </w:tcPr>
           <w:p>
-            <w:pPr>
-              <w:pStyle w:val="TableParagraph"/>
-            </w:pPr>
+            <w:r/>
           </w:p>
         </w:tc>
       </w:tr>
@@ -28918,12 +28624,6 @@
             <w:vAlign w:val="center"/>
           </w:tcPr>
           <w:p>
-            <w:pPr>
-              <w:pStyle w:val="TableParagraph"/>
-              <w:spacing w:before="134"/>
-              <w:ind w:left="176" w:right="168"/>
-              <w:jc w:val="center"/>
-            </w:pPr>
             <w:r>
               <w:t>9.10</w:t>
             </w:r>
@@ -28938,12 +28638,8 @@
             <w:vAlign w:val="center"/>
           </w:tcPr>
           <w:p>
-            <w:pPr>
-              <w:pStyle w:val="TableParagraph"/>
-              <w:jc w:val="center"/>
-            </w:pPr>
-            <w:r>
-              <w:t>Melihat daftar agenda pada tab Referral</w:t>
+            <w:r>
+              <w:t>Mengubah data acara dengan data valid</w:t>
             </w:r>
           </w:p>
         </w:tc>
@@ -28956,45 +28652,30 @@
             <w:vAlign w:val="center"/>
           </w:tcPr>
           <w:p>
-            <w:pPr>
-              <w:pStyle w:val="TableParagraph"/>
-              <w:jc w:val="center"/>
-              <w:rPr>
-                <w:w w:val="90"/>
-              </w:rPr>
-            </w:pPr>
-            <w:r>
-              <w:t>Klik tab Referral</w:t>
-            </w:r>
-          </w:p>
-        </w:tc>
-        <w:tc>
-          <w:tcPr>
-            <w:tcW w:w="2833" w:type="dxa"/>
-            <w:vAlign w:val="center"/>
-          </w:tcPr>
-          <w:p>
-            <w:pPr>
-              <w:pStyle w:val="TableParagraph"/>
-              <w:jc w:val="center"/>
-            </w:pPr>
-            <w:r>
-              <w:t>Berhasil menampilkan daftar nasabah referral pada Daily Sales Agenda.</w:t>
-            </w:r>
-          </w:p>
-        </w:tc>
-        <w:tc>
-          <w:tcPr>
-            <w:tcW w:w="2833" w:type="dxa"/>
-            <w:vAlign w:val="center"/>
-          </w:tcPr>
-          <w:p>
-            <w:pPr>
-              <w:pStyle w:val="TableParagraph"/>
-              <w:jc w:val="center"/>
-            </w:pPr>
-            <w:r>
-              <w:t>Berhasil menampilkan daftar nasabah referral pada Daily Sales Agenda.</w:t>
+            <w:r>
+              <w:t>Pada halaman Detail Acara, klik icon Edit (pensil) - Ubah data acara pada form Edit Acara - Klik button Simpan</w:t>
+            </w:r>
+          </w:p>
+        </w:tc>
+        <w:tc>
+          <w:tcPr>
+            <w:tcW w:w="2833" w:type="dxa"/>
+            <w:vAlign w:val="center"/>
+          </w:tcPr>
+          <w:p>
+            <w:r>
+              <w:t>Berhasil menyimpan perubahan data acara dengan data yang valid.</w:t>
+            </w:r>
+          </w:p>
+        </w:tc>
+        <w:tc>
+          <w:tcPr>
+            <w:tcW w:w="2833" w:type="dxa"/>
+            <w:vAlign w:val="center"/>
+          </w:tcPr>
+          <w:p>
+            <w:r>
+              <w:t>Berhasil menyimpan perubahan data acara dengan data yang valid.</w:t>
             </w:r>
           </w:p>
         </w:tc>
@@ -29004,10 +28685,6 @@
             <w:vAlign w:val="center"/>
           </w:tcPr>
           <w:p>
-            <w:pPr>
-              <w:pStyle w:val="TableParagraph"/>
-              <w:jc w:val="center"/>
-            </w:pPr>
             <w:r>
               <w:t>P</w:t>
             </w:r>
@@ -29018,9 +28695,7 @@
             <w:tcW w:w="1699" w:type="dxa"/>
           </w:tcPr>
           <w:p>
-            <w:pPr>
-              <w:pStyle w:val="TableParagraph"/>
-            </w:pPr>
+            <w:r/>
           </w:p>
         </w:tc>
       </w:tr>
@@ -29038,12 +28713,6 @@
             <w:vAlign w:val="center"/>
           </w:tcPr>
           <w:p>
-            <w:pPr>
-              <w:pStyle w:val="TableParagraph"/>
-              <w:spacing w:before="134"/>
-              <w:ind w:left="176" w:right="168"/>
-              <w:jc w:val="center"/>
-            </w:pPr>
             <w:r>
               <w:t>9.11</w:t>
             </w:r>
@@ -29058,12 +28727,8 @@
             <w:vAlign w:val="center"/>
           </w:tcPr>
           <w:p>
-            <w:pPr>
-              <w:pStyle w:val="TableParagraph"/>
-              <w:jc w:val="center"/>
-            </w:pPr>
-            <w:r>
-              <w:t>Melihat daftar agenda pada tab Ref. Closing</w:t>
+            <w:r>
+              <w:t>Membagikan acara kepada user</w:t>
             </w:r>
           </w:p>
         </w:tc>
@@ -29076,45 +28741,30 @@
             <w:vAlign w:val="center"/>
           </w:tcPr>
           <w:p>
-            <w:pPr>
-              <w:pStyle w:val="TableParagraph"/>
-              <w:jc w:val="center"/>
-              <w:rPr>
-                <w:w w:val="90"/>
-              </w:rPr>
-            </w:pPr>
-            <w:r>
-              <w:t>Klik tab Ref. Closing</w:t>
-            </w:r>
-          </w:p>
-        </w:tc>
-        <w:tc>
-          <w:tcPr>
-            <w:tcW w:w="2833" w:type="dxa"/>
-            <w:vAlign w:val="center"/>
-          </w:tcPr>
-          <w:p>
-            <w:pPr>
-              <w:pStyle w:val="TableParagraph"/>
-              <w:jc w:val="center"/>
-            </w:pPr>
-            <w:r>
-              <w:t>Berhasil menampilkan daftar nasabah referral yang closing pada Daily Sales Agenda.</w:t>
-            </w:r>
-          </w:p>
-        </w:tc>
-        <w:tc>
-          <w:tcPr>
-            <w:tcW w:w="2833" w:type="dxa"/>
-            <w:vAlign w:val="center"/>
-          </w:tcPr>
-          <w:p>
-            <w:pPr>
-              <w:pStyle w:val="TableParagraph"/>
-              <w:jc w:val="center"/>
-            </w:pPr>
-            <w:r>
-              <w:t>Berhasil menampilkan daftar nasabah referral yang closing pada Daily Sales Agenda.</w:t>
+            <w:r>
+              <w:t>Pada halaman Detail Acara, klik icon Bagikan (share) - Tentukan user watcher/assignee pada form Bagikan Acara - Klik button Bagikan</w:t>
+            </w:r>
+          </w:p>
+        </w:tc>
+        <w:tc>
+          <w:tcPr>
+            <w:tcW w:w="2833" w:type="dxa"/>
+            <w:vAlign w:val="center"/>
+          </w:tcPr>
+          <w:p>
+            <w:r>
+              <w:t>Berhasil membagikan acara kepada user dan memicu notifikasi kepada penerima.</w:t>
+            </w:r>
+          </w:p>
+        </w:tc>
+        <w:tc>
+          <w:tcPr>
+            <w:tcW w:w="2833" w:type="dxa"/>
+            <w:vAlign w:val="center"/>
+          </w:tcPr>
+          <w:p>
+            <w:r>
+              <w:t>Berhasil membagikan acara kepada user dan memicu notifikasi kepada penerima.</w:t>
             </w:r>
           </w:p>
         </w:tc>
@@ -29124,10 +28774,6 @@
             <w:vAlign w:val="center"/>
           </w:tcPr>
           <w:p>
-            <w:pPr>
-              <w:pStyle w:val="TableParagraph"/>
-              <w:jc w:val="center"/>
-            </w:pPr>
             <w:r>
               <w:t>P</w:t>
             </w:r>
@@ -29138,9 +28784,7 @@
             <w:tcW w:w="1699" w:type="dxa"/>
           </w:tcPr>
           <w:p>
-            <w:pPr>
-              <w:pStyle w:val="TableParagraph"/>
-            </w:pPr>
+            <w:r/>
           </w:p>
         </w:tc>
       </w:tr>
@@ -29158,12 +28802,6 @@
             <w:vAlign w:val="center"/>
           </w:tcPr>
           <w:p>
-            <w:pPr>
-              <w:pStyle w:val="TableParagraph"/>
-              <w:spacing w:before="134"/>
-              <w:ind w:left="176" w:right="168"/>
-              <w:jc w:val="center"/>
-            </w:pPr>
             <w:r>
               <w:t>9.12</w:t>
             </w:r>
@@ -29178,12 +28816,8 @@
             <w:vAlign w:val="center"/>
           </w:tcPr>
           <w:p>
-            <w:pPr>
-              <w:pStyle w:val="TableParagraph"/>
-              <w:jc w:val="center"/>
-            </w:pPr>
-            <w:r>
-              <w:t>Mencari agenda menggunakan Search Bar</w:t>
+            <w:r>
+              <w:t>Menghapus penugasan acara kepada user</w:t>
             </w:r>
           </w:p>
         </w:tc>
@@ -29196,45 +28830,30 @@
             <w:vAlign w:val="center"/>
           </w:tcPr>
           <w:p>
-            <w:pPr>
-              <w:pStyle w:val="TableParagraph"/>
-              <w:jc w:val="center"/>
-              <w:rPr>
-                <w:w w:val="90"/>
-              </w:rPr>
-            </w:pPr>
-            <w:r>
-              <w:t>Masukkan kata kunci pencarian pada Search Bar</w:t>
-            </w:r>
-          </w:p>
-        </w:tc>
-        <w:tc>
-          <w:tcPr>
-            <w:tcW w:w="2833" w:type="dxa"/>
-            <w:vAlign w:val="center"/>
-          </w:tcPr>
-          <w:p>
-            <w:pPr>
-              <w:pStyle w:val="TableParagraph"/>
-              <w:jc w:val="center"/>
-            </w:pPr>
-            <w:r>
-              <w:t>Berhasil menampilkan data agenda yang sesuai dengan kata kunci pencarian.</w:t>
-            </w:r>
-          </w:p>
-        </w:tc>
-        <w:tc>
-          <w:tcPr>
-            <w:tcW w:w="2833" w:type="dxa"/>
-            <w:vAlign w:val="center"/>
-          </w:tcPr>
-          <w:p>
-            <w:pPr>
-              <w:pStyle w:val="TableParagraph"/>
-              <w:jc w:val="center"/>
-            </w:pPr>
-            <w:r>
-              <w:t>Berhasil menampilkan data agenda yang sesuai dengan kata kunci pencarian.</w:t>
+            <w:r>
+              <w:t>Pada form Bagikan Acara, periksa daftar Ditugaskan ke (User) - Klik icon hapus (tempat sampah) pada user yang ditugaskan - Konfirmasi penghapusan penugasan acara</w:t>
+            </w:r>
+          </w:p>
+        </w:tc>
+        <w:tc>
+          <w:tcPr>
+            <w:tcW w:w="2833" w:type="dxa"/>
+            <w:vAlign w:val="center"/>
+          </w:tcPr>
+          <w:p>
+            <w:r>
+              <w:t>Berhasil menghapus penugasan acara kepada user dari daftar pembagian acara.</w:t>
+            </w:r>
+          </w:p>
+        </w:tc>
+        <w:tc>
+          <w:tcPr>
+            <w:tcW w:w="2833" w:type="dxa"/>
+            <w:vAlign w:val="center"/>
+          </w:tcPr>
+          <w:p>
+            <w:r>
+              <w:t>Berhasil menghapus penugasan acara kepada user dari daftar pembagian acara.</w:t>
             </w:r>
           </w:p>
         </w:tc>
@@ -29244,10 +28863,6 @@
             <w:vAlign w:val="center"/>
           </w:tcPr>
           <w:p>
-            <w:pPr>
-              <w:pStyle w:val="TableParagraph"/>
-              <w:jc w:val="center"/>
-            </w:pPr>
             <w:r>
               <w:t>P</w:t>
             </w:r>
@@ -29258,9 +28873,7 @@
             <w:tcW w:w="1699" w:type="dxa"/>
           </w:tcPr>
           <w:p>
-            <w:pPr>
-              <w:pStyle w:val="TableParagraph"/>
-            </w:pPr>
+            <w:r/>
           </w:p>
         </w:tc>
       </w:tr>
@@ -29278,12 +28891,6 @@
             <w:vAlign w:val="center"/>
           </w:tcPr>
           <w:p>
-            <w:pPr>
-              <w:pStyle w:val="TableParagraph"/>
-              <w:spacing w:before="134"/>
-              <w:ind w:left="176" w:right="168"/>
-              <w:jc w:val="center"/>
-            </w:pPr>
             <w:r>
               <w:t>9.13</w:t>
             </w:r>
@@ -29298,12 +28905,8 @@
             <w:vAlign w:val="center"/>
           </w:tcPr>
           <w:p>
-            <w:pPr>
-              <w:pStyle w:val="TableParagraph"/>
-              <w:jc w:val="center"/>
-            </w:pPr>
-            <w:r>
-              <w:t>Mencari agenda dengan keyword tidak valid</w:t>
+            <w:r>
+              <w:t>Menambahkan komentar pada acara</w:t>
             </w:r>
           </w:p>
         </w:tc>
@@ -29316,45 +28919,30 @@
             <w:vAlign w:val="center"/>
           </w:tcPr>
           <w:p>
-            <w:pPr>
-              <w:pStyle w:val="TableParagraph"/>
-              <w:jc w:val="center"/>
-              <w:rPr>
-                <w:w w:val="90"/>
-              </w:rPr>
-            </w:pPr>
-            <w:r>
-              <w:t>Masukkan keyword tidak valid pada Search Bar</w:t>
-            </w:r>
-          </w:p>
-        </w:tc>
-        <w:tc>
-          <w:tcPr>
-            <w:tcW w:w="2833" w:type="dxa"/>
-            <w:vAlign w:val="center"/>
-          </w:tcPr>
-          <w:p>
-            <w:pPr>
-              <w:pStyle w:val="TableParagraph"/>
-              <w:jc w:val="center"/>
-            </w:pPr>
-            <w:r>
-              <w:t>Berhasil menampilkan informasi data tidak ditemukan.</w:t>
-            </w:r>
-          </w:p>
-        </w:tc>
-        <w:tc>
-          <w:tcPr>
-            <w:tcW w:w="2833" w:type="dxa"/>
-            <w:vAlign w:val="center"/>
-          </w:tcPr>
-          <w:p>
-            <w:pPr>
-              <w:pStyle w:val="TableParagraph"/>
-              <w:jc w:val="center"/>
-            </w:pPr>
-            <w:r>
-              <w:t>Berhasil menampilkan informasi data tidak ditemukan.</w:t>
+            <w:r>
+              <w:t>Pada halaman Detail Acara, klik tab Aktivitas &amp; Percakapan - Tulis komentar pada kolom Tulis komentar - Klik button Kirim</w:t>
+            </w:r>
+          </w:p>
+        </w:tc>
+        <w:tc>
+          <w:tcPr>
+            <w:tcW w:w="2833" w:type="dxa"/>
+            <w:vAlign w:val="center"/>
+          </w:tcPr>
+          <w:p>
+            <w:r>
+              <w:t>Berhasil mengirimkan komentar dan menampilkan komentar baru pada daftar riwayat aktivitas acara.</w:t>
+            </w:r>
+          </w:p>
+        </w:tc>
+        <w:tc>
+          <w:tcPr>
+            <w:tcW w:w="2833" w:type="dxa"/>
+            <w:vAlign w:val="center"/>
+          </w:tcPr>
+          <w:p>
+            <w:r>
+              <w:t>Berhasil mengirimkan komentar dan menampilkan komentar baru pada daftar riwayat aktivitas acara.</w:t>
             </w:r>
           </w:p>
         </w:tc>
@@ -29364,10 +28952,6 @@
             <w:vAlign w:val="center"/>
           </w:tcPr>
           <w:p>
-            <w:pPr>
-              <w:pStyle w:val="TableParagraph"/>
-              <w:jc w:val="center"/>
-            </w:pPr>
             <w:r>
               <w:t>P</w:t>
             </w:r>
@@ -29378,9 +28962,7 @@
             <w:tcW w:w="1699" w:type="dxa"/>
           </w:tcPr>
           <w:p>
-            <w:pPr>
-              <w:pStyle w:val="TableParagraph"/>
-            </w:pPr>
+            <w:r/>
           </w:p>
         </w:tc>
       </w:tr>
@@ -29398,12 +28980,6 @@
             <w:vAlign w:val="center"/>
           </w:tcPr>
           <w:p>
-            <w:pPr>
-              <w:pStyle w:val="TableParagraph"/>
-              <w:spacing w:before="134"/>
-              <w:ind w:left="176" w:right="168"/>
-              <w:jc w:val="center"/>
-            </w:pPr>
             <w:r>
               <w:t>9.14</w:t>
             </w:r>
@@ -29418,10 +28994,718 @@
             <w:vAlign w:val="center"/>
           </w:tcPr>
           <w:p>
-            <w:pPr>
-              <w:pStyle w:val="TableParagraph"/>
-              <w:jc w:val="center"/>
-            </w:pPr>
+            <w:r>
+              <w:t>Menghapus komentar pada acara</w:t>
+            </w:r>
+          </w:p>
+        </w:tc>
+        <w:tc>
+          <w:tcPr>
+            <w:tcW w:w="2551" w:type="dxa"/>
+            <w:tcBorders>
+              <w:bottom w:val="single" w:sz="4" w:space="0" w:color="auto"/>
+            </w:tcBorders>
+            <w:vAlign w:val="center"/>
+          </w:tcPr>
+          <w:p>
+            <w:r>
+              <w:t>Pada halaman Detail Acara, klik tab Aktivitas &amp; Percakapan - Klik icon hapus (tempat sampah) pada komentar yang ingin dihapus - Konfirmasi penghapusan komentar</w:t>
+            </w:r>
+          </w:p>
+        </w:tc>
+        <w:tc>
+          <w:tcPr>
+            <w:tcW w:w="2833" w:type="dxa"/>
+            <w:vAlign w:val="center"/>
+          </w:tcPr>
+          <w:p>
+            <w:r>
+              <w:t>Berhasil menghapus komentar dari daftar aktivitas dan percakapan acara.</w:t>
+            </w:r>
+          </w:p>
+        </w:tc>
+        <w:tc>
+          <w:tcPr>
+            <w:tcW w:w="2833" w:type="dxa"/>
+            <w:vAlign w:val="center"/>
+          </w:tcPr>
+          <w:p>
+            <w:r>
+              <w:t>Berhasil menghapus komentar dari daftar aktivitas dan percakapan acara.</w:t>
+            </w:r>
+          </w:p>
+        </w:tc>
+        <w:tc>
+          <w:tcPr>
+            <w:tcW w:w="1277" w:type="dxa"/>
+            <w:vAlign w:val="center"/>
+          </w:tcPr>
+          <w:p>
+            <w:r>
+              <w:t>P</w:t>
+            </w:r>
+          </w:p>
+        </w:tc>
+        <w:tc>
+          <w:tcPr>
+            <w:tcW w:w="1699" w:type="dxa"/>
+          </w:tcPr>
+          <w:p>
+            <w:r/>
+          </w:p>
+        </w:tc>
+      </w:tr>
+      <w:tr>
+        <w:trPr>
+          <w:trHeight w:val="537"/>
+        </w:trPr>
+        <w:tc>
+          <w:tcPr>
+            <w:tcW w:w="867" w:type="dxa"/>
+            <w:tcBorders>
+              <w:left w:val="single" w:sz="6" w:space="0" w:color="000000"/>
+              <w:bottom w:val="single" w:sz="4" w:space="0" w:color="auto"/>
+            </w:tcBorders>
+            <w:vAlign w:val="center"/>
+          </w:tcPr>
+          <w:p>
+            <w:r>
+              <w:t>9.15</w:t>
+            </w:r>
+          </w:p>
+        </w:tc>
+        <w:tc>
+          <w:tcPr>
+            <w:tcW w:w="2127" w:type="dxa"/>
+            <w:tcBorders>
+              <w:bottom w:val="single" w:sz="4" w:space="0" w:color="auto"/>
+            </w:tcBorders>
+            <w:vAlign w:val="center"/>
+          </w:tcPr>
+          <w:p>
+            <w:r>
+              <w:t>Membuka halaman Daily Sales Agenda</w:t>
+            </w:r>
+          </w:p>
+        </w:tc>
+        <w:tc>
+          <w:tcPr>
+            <w:tcW w:w="2551" w:type="dxa"/>
+            <w:tcBorders>
+              <w:bottom w:val="single" w:sz="4" w:space="0" w:color="auto"/>
+            </w:tcBorders>
+            <w:vAlign w:val="center"/>
+          </w:tcPr>
+          <w:p>
+            <w:r>
+              <w:t>Buka menu Lainnya - Klik menu Daily Sales Agenda</w:t>
+            </w:r>
+          </w:p>
+        </w:tc>
+        <w:tc>
+          <w:tcPr>
+            <w:tcW w:w="2833" w:type="dxa"/>
+            <w:vAlign w:val="center"/>
+          </w:tcPr>
+          <w:p>
+            <w:r>
+              <w:t>Berhasil menampilkan halaman Daily Sales Agenda.</w:t>
+            </w:r>
+          </w:p>
+        </w:tc>
+        <w:tc>
+          <w:tcPr>
+            <w:tcW w:w="2833" w:type="dxa"/>
+            <w:vAlign w:val="center"/>
+          </w:tcPr>
+          <w:p>
+            <w:r>
+              <w:t>Berhasil menampilkan halaman Daily Sales Agenda.</w:t>
+            </w:r>
+          </w:p>
+        </w:tc>
+        <w:tc>
+          <w:tcPr>
+            <w:tcW w:w="1277" w:type="dxa"/>
+            <w:vAlign w:val="center"/>
+          </w:tcPr>
+          <w:p>
+            <w:r>
+              <w:t>P</w:t>
+            </w:r>
+          </w:p>
+        </w:tc>
+        <w:tc>
+          <w:tcPr>
+            <w:tcW w:w="1699" w:type="dxa"/>
+          </w:tcPr>
+          <w:p>
+            <w:r/>
+          </w:p>
+        </w:tc>
+      </w:tr>
+      <w:tr>
+        <w:trPr>
+          <w:trHeight w:val="537"/>
+        </w:trPr>
+        <w:tc>
+          <w:tcPr>
+            <w:tcW w:w="867" w:type="dxa"/>
+            <w:tcBorders>
+              <w:left w:val="single" w:sz="6" w:space="0" w:color="000000"/>
+              <w:bottom w:val="single" w:sz="4" w:space="0" w:color="auto"/>
+            </w:tcBorders>
+            <w:vAlign w:val="center"/>
+          </w:tcPr>
+          <w:p>
+            <w:r>
+              <w:t>9.16</w:t>
+            </w:r>
+          </w:p>
+        </w:tc>
+        <w:tc>
+          <w:tcPr>
+            <w:tcW w:w="2127" w:type="dxa"/>
+            <w:tcBorders>
+              <w:bottom w:val="single" w:sz="4" w:space="0" w:color="auto"/>
+            </w:tcBorders>
+            <w:vAlign w:val="center"/>
+          </w:tcPr>
+          <w:p>
+            <w:r>
+              <w:t>Melihat daftar agenda pada tab Masuk</w:t>
+            </w:r>
+          </w:p>
+        </w:tc>
+        <w:tc>
+          <w:tcPr>
+            <w:tcW w:w="2551" w:type="dxa"/>
+            <w:tcBorders>
+              <w:bottom w:val="single" w:sz="4" w:space="0" w:color="auto"/>
+            </w:tcBorders>
+            <w:vAlign w:val="center"/>
+          </w:tcPr>
+          <w:p>
+            <w:r>
+              <w:t>Klik tab Masuk</w:t>
+            </w:r>
+          </w:p>
+        </w:tc>
+        <w:tc>
+          <w:tcPr>
+            <w:tcW w:w="2833" w:type="dxa"/>
+            <w:vAlign w:val="center"/>
+          </w:tcPr>
+          <w:p>
+            <w:r>
+              <w:t>Berhasil menampilkan daftar nasabah yang masuk pada Daily Sales Agenda.</w:t>
+            </w:r>
+          </w:p>
+        </w:tc>
+        <w:tc>
+          <w:tcPr>
+            <w:tcW w:w="2833" w:type="dxa"/>
+            <w:vAlign w:val="center"/>
+          </w:tcPr>
+          <w:p>
+            <w:r>
+              <w:t>Berhasil menampilkan daftar nasabah yang masuk pada Daily Sales Agenda.</w:t>
+            </w:r>
+          </w:p>
+        </w:tc>
+        <w:tc>
+          <w:tcPr>
+            <w:tcW w:w="1277" w:type="dxa"/>
+            <w:vAlign w:val="center"/>
+          </w:tcPr>
+          <w:p>
+            <w:r>
+              <w:t>P</w:t>
+            </w:r>
+          </w:p>
+        </w:tc>
+        <w:tc>
+          <w:tcPr>
+            <w:tcW w:w="1699" w:type="dxa"/>
+          </w:tcPr>
+          <w:p>
+            <w:r/>
+          </w:p>
+        </w:tc>
+      </w:tr>
+      <w:tr>
+        <w:trPr>
+          <w:trHeight w:val="537"/>
+        </w:trPr>
+        <w:tc>
+          <w:tcPr>
+            <w:tcW w:w="867" w:type="dxa"/>
+            <w:tcBorders>
+              <w:left w:val="single" w:sz="6" w:space="0" w:color="000000"/>
+              <w:bottom w:val="single" w:sz="4" w:space="0" w:color="auto"/>
+            </w:tcBorders>
+            <w:vAlign w:val="center"/>
+          </w:tcPr>
+          <w:p>
+            <w:r>
+              <w:t>9.17</w:t>
+            </w:r>
+          </w:p>
+        </w:tc>
+        <w:tc>
+          <w:tcPr>
+            <w:tcW w:w="2127" w:type="dxa"/>
+            <w:tcBorders>
+              <w:bottom w:val="single" w:sz="4" w:space="0" w:color="auto"/>
+            </w:tcBorders>
+            <w:vAlign w:val="center"/>
+          </w:tcPr>
+          <w:p>
+            <w:r>
+              <w:t>Melihat daftar agenda pada tab Closing</w:t>
+            </w:r>
+          </w:p>
+        </w:tc>
+        <w:tc>
+          <w:tcPr>
+            <w:tcW w:w="2551" w:type="dxa"/>
+            <w:tcBorders>
+              <w:bottom w:val="single" w:sz="4" w:space="0" w:color="auto"/>
+            </w:tcBorders>
+            <w:vAlign w:val="center"/>
+          </w:tcPr>
+          <w:p>
+            <w:r>
+              <w:t>Klik tab Closing</w:t>
+            </w:r>
+          </w:p>
+        </w:tc>
+        <w:tc>
+          <w:tcPr>
+            <w:tcW w:w="2833" w:type="dxa"/>
+            <w:vAlign w:val="center"/>
+          </w:tcPr>
+          <w:p>
+            <w:r>
+              <w:t>Berhasil menampilkan daftar nasabah yang closing pada Daily Sales Agenda.</w:t>
+            </w:r>
+          </w:p>
+        </w:tc>
+        <w:tc>
+          <w:tcPr>
+            <w:tcW w:w="2833" w:type="dxa"/>
+            <w:vAlign w:val="center"/>
+          </w:tcPr>
+          <w:p>
+            <w:r>
+              <w:t>Berhasil menampilkan daftar nasabah yang closing pada Daily Sales Agenda.</w:t>
+            </w:r>
+          </w:p>
+        </w:tc>
+        <w:tc>
+          <w:tcPr>
+            <w:tcW w:w="1277" w:type="dxa"/>
+            <w:vAlign w:val="center"/>
+          </w:tcPr>
+          <w:p>
+            <w:r>
+              <w:t>P</w:t>
+            </w:r>
+          </w:p>
+        </w:tc>
+        <w:tc>
+          <w:tcPr>
+            <w:tcW w:w="1699" w:type="dxa"/>
+          </w:tcPr>
+          <w:p>
+            <w:r/>
+          </w:p>
+        </w:tc>
+      </w:tr>
+      <w:tr>
+        <w:trPr>
+          <w:trHeight w:val="537"/>
+        </w:trPr>
+        <w:tc>
+          <w:tcPr>
+            <w:tcW w:w="867" w:type="dxa"/>
+            <w:tcBorders>
+              <w:left w:val="single" w:sz="6" w:space="0" w:color="000000"/>
+              <w:bottom w:val="single" w:sz="4" w:space="0" w:color="auto"/>
+            </w:tcBorders>
+            <w:vAlign w:val="center"/>
+          </w:tcPr>
+          <w:p>
+            <w:r>
+              <w:t>9.18</w:t>
+            </w:r>
+          </w:p>
+        </w:tc>
+        <w:tc>
+          <w:tcPr>
+            <w:tcW w:w="2127" w:type="dxa"/>
+            <w:tcBorders>
+              <w:bottom w:val="single" w:sz="4" w:space="0" w:color="auto"/>
+            </w:tcBorders>
+            <w:vAlign w:val="center"/>
+          </w:tcPr>
+          <w:p>
+            <w:r>
+              <w:t>Melihat daftar agenda pada tab Referral</w:t>
+            </w:r>
+          </w:p>
+        </w:tc>
+        <w:tc>
+          <w:tcPr>
+            <w:tcW w:w="2551" w:type="dxa"/>
+            <w:tcBorders>
+              <w:bottom w:val="single" w:sz="4" w:space="0" w:color="auto"/>
+            </w:tcBorders>
+            <w:vAlign w:val="center"/>
+          </w:tcPr>
+          <w:p>
+            <w:r>
+              <w:t>Klik tab Referral</w:t>
+            </w:r>
+          </w:p>
+        </w:tc>
+        <w:tc>
+          <w:tcPr>
+            <w:tcW w:w="2833" w:type="dxa"/>
+            <w:vAlign w:val="center"/>
+          </w:tcPr>
+          <w:p>
+            <w:r>
+              <w:t>Berhasil menampilkan daftar nasabah referral pada Daily Sales Agenda.</w:t>
+            </w:r>
+          </w:p>
+        </w:tc>
+        <w:tc>
+          <w:tcPr>
+            <w:tcW w:w="2833" w:type="dxa"/>
+            <w:vAlign w:val="center"/>
+          </w:tcPr>
+          <w:p>
+            <w:r>
+              <w:t>Berhasil menampilkan daftar nasabah referral pada Daily Sales Agenda.</w:t>
+            </w:r>
+          </w:p>
+        </w:tc>
+        <w:tc>
+          <w:tcPr>
+            <w:tcW w:w="1277" w:type="dxa"/>
+            <w:vAlign w:val="center"/>
+          </w:tcPr>
+          <w:p>
+            <w:r>
+              <w:t>P</w:t>
+            </w:r>
+          </w:p>
+        </w:tc>
+        <w:tc>
+          <w:tcPr>
+            <w:tcW w:w="1699" w:type="dxa"/>
+          </w:tcPr>
+          <w:p>
+            <w:r/>
+          </w:p>
+        </w:tc>
+      </w:tr>
+      <w:tr>
+        <w:trPr>
+          <w:trHeight w:val="537"/>
+        </w:trPr>
+        <w:tc>
+          <w:tcPr>
+            <w:tcW w:w="867" w:type="dxa"/>
+            <w:tcBorders>
+              <w:left w:val="single" w:sz="6" w:space="0" w:color="000000"/>
+              <w:bottom w:val="single" w:sz="4" w:space="0" w:color="auto"/>
+            </w:tcBorders>
+            <w:vAlign w:val="center"/>
+          </w:tcPr>
+          <w:p>
+            <w:r>
+              <w:t>9.19</w:t>
+            </w:r>
+          </w:p>
+        </w:tc>
+        <w:tc>
+          <w:tcPr>
+            <w:tcW w:w="2127" w:type="dxa"/>
+            <w:tcBorders>
+              <w:bottom w:val="single" w:sz="4" w:space="0" w:color="auto"/>
+            </w:tcBorders>
+            <w:vAlign w:val="center"/>
+          </w:tcPr>
+          <w:p>
+            <w:r>
+              <w:t>Melihat daftar agenda pada tab Ref. Closing</w:t>
+            </w:r>
+          </w:p>
+        </w:tc>
+        <w:tc>
+          <w:tcPr>
+            <w:tcW w:w="2551" w:type="dxa"/>
+            <w:tcBorders>
+              <w:bottom w:val="single" w:sz="4" w:space="0" w:color="auto"/>
+            </w:tcBorders>
+            <w:vAlign w:val="center"/>
+          </w:tcPr>
+          <w:p>
+            <w:r>
+              <w:t>Klik tab Ref. Closing</w:t>
+            </w:r>
+          </w:p>
+        </w:tc>
+        <w:tc>
+          <w:tcPr>
+            <w:tcW w:w="2833" w:type="dxa"/>
+            <w:vAlign w:val="center"/>
+          </w:tcPr>
+          <w:p>
+            <w:r>
+              <w:t>Berhasil menampilkan daftar nasabah referral yang closing pada Daily Sales Agenda.</w:t>
+            </w:r>
+          </w:p>
+        </w:tc>
+        <w:tc>
+          <w:tcPr>
+            <w:tcW w:w="2833" w:type="dxa"/>
+            <w:vAlign w:val="center"/>
+          </w:tcPr>
+          <w:p>
+            <w:r>
+              <w:t>Berhasil menampilkan daftar nasabah referral yang closing pada Daily Sales Agenda.</w:t>
+            </w:r>
+          </w:p>
+        </w:tc>
+        <w:tc>
+          <w:tcPr>
+            <w:tcW w:w="1277" w:type="dxa"/>
+            <w:vAlign w:val="center"/>
+          </w:tcPr>
+          <w:p>
+            <w:r>
+              <w:t>P</w:t>
+            </w:r>
+          </w:p>
+        </w:tc>
+        <w:tc>
+          <w:tcPr>
+            <w:tcW w:w="1699" w:type="dxa"/>
+          </w:tcPr>
+          <w:p>
+            <w:r/>
+          </w:p>
+        </w:tc>
+      </w:tr>
+      <w:tr>
+        <w:trPr>
+          <w:trHeight w:val="537"/>
+        </w:trPr>
+        <w:tc>
+          <w:tcPr>
+            <w:tcW w:w="867" w:type="dxa"/>
+            <w:tcBorders>
+              <w:left w:val="single" w:sz="6" w:space="0" w:color="000000"/>
+              <w:bottom w:val="single" w:sz="4" w:space="0" w:color="auto"/>
+            </w:tcBorders>
+            <w:vAlign w:val="center"/>
+          </w:tcPr>
+          <w:p>
+            <w:r>
+              <w:t>9.20</w:t>
+            </w:r>
+          </w:p>
+        </w:tc>
+        <w:tc>
+          <w:tcPr>
+            <w:tcW w:w="2127" w:type="dxa"/>
+            <w:tcBorders>
+              <w:bottom w:val="single" w:sz="4" w:space="0" w:color="auto"/>
+            </w:tcBorders>
+            <w:vAlign w:val="center"/>
+          </w:tcPr>
+          <w:p>
+            <w:r>
+              <w:t>Mencari agenda menggunakan Search Bar</w:t>
+            </w:r>
+          </w:p>
+        </w:tc>
+        <w:tc>
+          <w:tcPr>
+            <w:tcW w:w="2551" w:type="dxa"/>
+            <w:tcBorders>
+              <w:bottom w:val="single" w:sz="4" w:space="0" w:color="auto"/>
+            </w:tcBorders>
+            <w:vAlign w:val="center"/>
+          </w:tcPr>
+          <w:p>
+            <w:r>
+              <w:t>Masukkan kata kunci pencarian pada Search Bar</w:t>
+            </w:r>
+          </w:p>
+        </w:tc>
+        <w:tc>
+          <w:tcPr>
+            <w:tcW w:w="2833" w:type="dxa"/>
+            <w:vAlign w:val="center"/>
+          </w:tcPr>
+          <w:p>
+            <w:r>
+              <w:t>Berhasil menampilkan data agenda yang sesuai dengan kata kunci pencarian.</w:t>
+            </w:r>
+          </w:p>
+        </w:tc>
+        <w:tc>
+          <w:tcPr>
+            <w:tcW w:w="2833" w:type="dxa"/>
+            <w:vAlign w:val="center"/>
+          </w:tcPr>
+          <w:p>
+            <w:r>
+              <w:t>Berhasil menampilkan data agenda yang sesuai dengan kata kunci pencarian.</w:t>
+            </w:r>
+          </w:p>
+        </w:tc>
+        <w:tc>
+          <w:tcPr>
+            <w:tcW w:w="1277" w:type="dxa"/>
+            <w:vAlign w:val="center"/>
+          </w:tcPr>
+          <w:p>
+            <w:r>
+              <w:t>P</w:t>
+            </w:r>
+          </w:p>
+        </w:tc>
+        <w:tc>
+          <w:tcPr>
+            <w:tcW w:w="1699" w:type="dxa"/>
+          </w:tcPr>
+          <w:p>
+            <w:r/>
+          </w:p>
+        </w:tc>
+      </w:tr>
+      <w:tr>
+        <w:trPr>
+          <w:trHeight w:val="537"/>
+        </w:trPr>
+        <w:tc>
+          <w:tcPr>
+            <w:tcW w:w="867" w:type="dxa"/>
+            <w:tcBorders>
+              <w:left w:val="single" w:sz="6" w:space="0" w:color="000000"/>
+              <w:bottom w:val="single" w:sz="4" w:space="0" w:color="auto"/>
+            </w:tcBorders>
+            <w:vAlign w:val="center"/>
+          </w:tcPr>
+          <w:p>
+            <w:r>
+              <w:t>9.21</w:t>
+            </w:r>
+          </w:p>
+        </w:tc>
+        <w:tc>
+          <w:tcPr>
+            <w:tcW w:w="2127" w:type="dxa"/>
+            <w:tcBorders>
+              <w:bottom w:val="single" w:sz="4" w:space="0" w:color="auto"/>
+            </w:tcBorders>
+            <w:vAlign w:val="center"/>
+          </w:tcPr>
+          <w:p>
+            <w:r>
+              <w:t>Mencari agenda dengan keyword tidak valid</w:t>
+            </w:r>
+          </w:p>
+        </w:tc>
+        <w:tc>
+          <w:tcPr>
+            <w:tcW w:w="2551" w:type="dxa"/>
+            <w:tcBorders>
+              <w:bottom w:val="single" w:sz="4" w:space="0" w:color="auto"/>
+            </w:tcBorders>
+            <w:vAlign w:val="center"/>
+          </w:tcPr>
+          <w:p>
+            <w:r>
+              <w:t>Masukkan keyword tidak valid pada Search Bar</w:t>
+            </w:r>
+          </w:p>
+        </w:tc>
+        <w:tc>
+          <w:tcPr>
+            <w:tcW w:w="2833" w:type="dxa"/>
+            <w:vAlign w:val="center"/>
+          </w:tcPr>
+          <w:p>
+            <w:r>
+              <w:t>Berhasil menampilkan informasi data tidak ditemukan.</w:t>
+            </w:r>
+          </w:p>
+        </w:tc>
+        <w:tc>
+          <w:tcPr>
+            <w:tcW w:w="2833" w:type="dxa"/>
+            <w:vAlign w:val="center"/>
+          </w:tcPr>
+          <w:p>
+            <w:r>
+              <w:t>Berhasil menampilkan informasi data tidak ditemukan.</w:t>
+            </w:r>
+          </w:p>
+        </w:tc>
+        <w:tc>
+          <w:tcPr>
+            <w:tcW w:w="1277" w:type="dxa"/>
+            <w:vAlign w:val="center"/>
+          </w:tcPr>
+          <w:p>
+            <w:r>
+              <w:t>P</w:t>
+            </w:r>
+          </w:p>
+        </w:tc>
+        <w:tc>
+          <w:tcPr>
+            <w:tcW w:w="1699" w:type="dxa"/>
+          </w:tcPr>
+          <w:p>
+            <w:r/>
+          </w:p>
+        </w:tc>
+      </w:tr>
+      <w:tr>
+        <w:trPr>
+          <w:trHeight w:val="537"/>
+        </w:trPr>
+        <w:tc>
+          <w:tcPr>
+            <w:tcW w:w="867" w:type="dxa"/>
+            <w:tcBorders>
+              <w:left w:val="single" w:sz="6" w:space="0" w:color="000000"/>
+              <w:bottom w:val="single" w:sz="4" w:space="0" w:color="auto"/>
+            </w:tcBorders>
+            <w:vAlign w:val="center"/>
+          </w:tcPr>
+          <w:p>
+            <w:r>
+              <w:t>9.22</w:t>
+            </w:r>
+          </w:p>
+        </w:tc>
+        <w:tc>
+          <w:tcPr>
+            <w:tcW w:w="2127" w:type="dxa"/>
+            <w:tcBorders>
+              <w:bottom w:val="single" w:sz="4" w:space="0" w:color="auto"/>
+            </w:tcBorders>
+            <w:vAlign w:val="center"/>
+          </w:tcPr>
+          <w:p>
             <w:r>
               <w:t>Melakukan filter data Daily Sales Agenda</w:t>
             </w:r>
@@ -29436,13 +29720,6 @@
             <w:vAlign w:val="center"/>
           </w:tcPr>
           <w:p>
-            <w:pPr>
-              <w:pStyle w:val="TableParagraph"/>
-              <w:jc w:val="center"/>
-              <w:rPr>
-                <w:w w:val="90"/>
-              </w:rPr>
-            </w:pPr>
             <w:r>
               <w:t>Klik button Filter - Pilih kriteria filter pada form Filter (Product, Bulan, Tahun) - Klik button Submit</w:t>
             </w:r>
@@ -29454,10 +29731,6 @@
             <w:vAlign w:val="center"/>
           </w:tcPr>
           <w:p>
-            <w:pPr>
-              <w:pStyle w:val="TableParagraph"/>
-              <w:jc w:val="center"/>
-            </w:pPr>
             <w:r>
               <w:t>Berhasil menampilkan data Daily Sales Agenda sesuai filter yang dipilih.</w:t>
             </w:r>
@@ -29469,10 +29742,6 @@
             <w:vAlign w:val="center"/>
           </w:tcPr>
           <w:p>
-            <w:pPr>
-              <w:pStyle w:val="TableParagraph"/>
-              <w:jc w:val="center"/>
-            </w:pPr>
             <w:r>
               <w:t>Berhasil menampilkan data Daily Sales Agenda sesuai filter yang dipilih.</w:t>
             </w:r>
@@ -29484,10 +29753,6 @@
             <w:vAlign w:val="center"/>
           </w:tcPr>
           <w:p>
-            <w:pPr>
-              <w:pStyle w:val="TableParagraph"/>
-              <w:jc w:val="center"/>
-            </w:pPr>
             <w:r>
               <w:t>P</w:t>
             </w:r>
@@ -29498,9 +29763,7 @@
             <w:tcW w:w="1699" w:type="dxa"/>
           </w:tcPr>
           <w:p>
-            <w:pPr>
-              <w:pStyle w:val="TableParagraph"/>
-            </w:pPr>
+            <w:r/>
           </w:p>
         </w:tc>
       </w:tr>

</xml_diff>